<commit_message>
Update report skill with five-level headings and WPS/Word verification
</commit_message>
<xml_diff>
--- a/write-szu-academic-report/assets/strict-starter.docx
+++ b/write-szu-academic-report/assets/strict-starter.docx
@@ -3,362 +3,226 @@
 <w:document xmlns:wpc="http://schemas.microsoft.com/office/word/2010/wordprocessingCanvas" xmlns:mo="http://schemas.microsoft.com/office/mac/office/2008/main" xmlns:mc="http://schemas.openxmlformats.org/markup-compatibility/2006" xmlns:mv="urn:schemas-microsoft-com:mac:vml" xmlns:o="urn:schemas-microsoft-com:office:office" xmlns:r="http://schemas.openxmlformats.org/officeDocument/2006/relationships" xmlns:m="http://schemas.openxmlformats.org/officeDocument/2006/math" xmlns:v="urn:schemas-microsoft-com:vml" xmlns:wp14="http://schemas.microsoft.com/office/word/2010/wordprocessingDrawing" xmlns:wp="http://schemas.openxmlformats.org/drawingml/2006/wordprocessingDrawing" xmlns:w10="urn:schemas-microsoft-com:office:word" xmlns:w="http://schemas.openxmlformats.org/wordprocessingml/2006/main" xmlns:w14="http://schemas.microsoft.com/office/word/2010/wordml" xmlns:wpg="http://schemas.microsoft.com/office/word/2010/wordprocessingGroup" xmlns:wpi="http://schemas.microsoft.com/office/word/2010/wordprocessingInk" xmlns:wne="http://schemas.microsoft.com/office/word/2006/wordml" xmlns:wps="http://schemas.microsoft.com/office/word/2010/wordprocessingShape" mc:Ignorable="w14 wp14">
   <w:body>
     <w:p>
-      <w:pPr>
-        <w:pStyle w:val="Title"/>
-        <w:jc w:val="center"/>
-      </w:pPr>
       <w:r>
-        <w:rPr>
-          <w:rFonts w:ascii="Times New Roman" w:hAnsi="Times New Roman" w:eastAsia="宋体"/>
-          <w:sz w:val="30"/>
-        </w:rPr>
-        <w:t>深圳大学实验报告标题</w:t>
+        <w:t>深圳大学实验报告</w:t>
+      </w:r>
+    </w:p>
+    <w:p>
+      <w:r>
+        <w:t>课程名称：</w:t>
+      </w:r>
+    </w:p>
+    <w:p>
+      <w:r>
+        <w:t>实验名称：</w:t>
+      </w:r>
+    </w:p>
+    <w:p>
+      <w:r>
+        <w:t>姓名：</w:t>
+      </w:r>
+    </w:p>
+    <w:p>
+      <w:r>
+        <w:t>学号：</w:t>
+      </w:r>
+    </w:p>
+    <w:p>
+      <w:r>
+        <w:t>学院：</w:t>
+      </w:r>
+    </w:p>
+    <w:p>
+      <w:r>
+        <w:t>实验日期：</w:t>
+      </w:r>
+    </w:p>
+    <w:p>
+      <w:r>
+        <w:br w:type="page"/>
       </w:r>
     </w:p>
     <w:p>
       <w:pPr>
-        <w:pStyle w:val="Heading1"/>
+        <w:pStyle w:val="SZUHeading1"/>
+        <w:keepNext w:val="1"/>
+        <w:keepLines w:val="1"/>
+        <w:pageBreakBefore w:val="0"/>
+        <w:numPr>
+          <w:ilvl w:val="0"/>
+          <w:numId w:val="10"/>
+        </w:numPr>
+        <w:spacing w:before="120" w:after="60" w:line="240" w:lineRule="auto"/>
+        <w:ind w:left="0" w:leftChars="0" w:firstLine="0" w:firstLineChars="0"/>
+        <w:jc w:val="left"/>
+        <w:outlineLvl w:val="0"/>
       </w:pPr>
       <w:r>
-        <w:t>1 实验目的</w:t>
+        <w:rPr>
+          <w:rFonts w:ascii="SimHei" w:hAnsi="SimHei" w:eastAsia="SimHei" w:cs="SimHei"/>
+          <w:b/>
+          <w:bCs w:val="1"/>
+          <w:color w:val="auto"/>
+          <w:sz w:val="28"/>
+          <w:szCs w:val="28"/>
+        </w:rPr>
+        <w:t>实验目的与要求</w:t>
       </w:r>
     </w:p>
     <w:p>
       <w:pPr>
-        <w:ind w:firstLine="420"/>
-        <w:jc w:val="both"/>
+        <w:pStyle w:val="SZUBody"/>
       </w:pPr>
       <w:r>
         <w:rPr>
-          <w:rFonts w:ascii="Times New Roman" w:hAnsi="Times New Roman" w:eastAsia="宋体"/>
+          <w:rFonts w:ascii="Times New Roman" w:hAnsi="Times New Roman" w:eastAsia="SimSun" w:cs="Times New Roman"/>
+          <w:b w:val="0"/>
+          <w:bCs w:val="0"/>
+          <w:color w:val="auto"/>
           <w:sz w:val="21"/>
+          <w:szCs w:val="21"/>
         </w:rPr>
-        <w:t>在此填写实验目的。正文使用宋体五号，英文与数字使用 Times New Roman 五号，并设置两字符首行缩进。</w:t>
+        <w:t>填写本实验的问题、目标及要求。</w:t>
       </w:r>
     </w:p>
     <w:p>
       <w:pPr>
-        <w:pStyle w:val="Heading1"/>
+        <w:pStyle w:val="SZUHeading1"/>
+        <w:keepNext w:val="1"/>
+        <w:keepLines w:val="1"/>
+        <w:pageBreakBefore w:val="0"/>
+        <w:numPr>
+          <w:ilvl w:val="0"/>
+          <w:numId w:val="10"/>
+        </w:numPr>
+        <w:spacing w:before="120" w:after="60" w:line="240" w:lineRule="auto"/>
+        <w:ind w:left="0" w:leftChars="0" w:firstLine="0" w:firstLineChars="0"/>
+        <w:jc w:val="left"/>
+        <w:outlineLvl w:val="0"/>
       </w:pPr>
       <w:r>
-        <w:t>2 实验内容</w:t>
+        <w:rPr>
+          <w:rFonts w:ascii="SimHei" w:hAnsi="SimHei" w:eastAsia="SimHei" w:cs="SimHei"/>
+          <w:b/>
+          <w:bCs w:val="1"/>
+          <w:color w:val="auto"/>
+          <w:sz w:val="28"/>
+          <w:szCs w:val="28"/>
+        </w:rPr>
+        <w:t>实验方法与实现</w:t>
       </w:r>
     </w:p>
     <w:p>
       <w:pPr>
-        <w:pStyle w:val="Heading2"/>
+        <w:pStyle w:val="SZUBody"/>
       </w:pPr>
       <w:r>
-        <w:t>2.1 问题分析</w:t>
+        <w:rPr>
+          <w:rFonts w:ascii="Times New Roman" w:hAnsi="Times New Roman" w:eastAsia="SimSun" w:cs="Times New Roman"/>
+          <w:b w:val="0"/>
+          <w:bCs w:val="0"/>
+          <w:color w:val="auto"/>
+          <w:sz w:val="21"/>
+          <w:szCs w:val="21"/>
+        </w:rPr>
+        <w:t>按真实实验内容建立必要的下级标题。</w:t>
       </w:r>
     </w:p>
     <w:p>
       <w:pPr>
-        <w:ind w:firstLine="420"/>
-        <w:jc w:val="both"/>
+        <w:pStyle w:val="SZUHeading1"/>
+        <w:keepNext w:val="1"/>
+        <w:keepLines w:val="1"/>
+        <w:pageBreakBefore w:val="0"/>
+        <w:numPr>
+          <w:ilvl w:val="0"/>
+          <w:numId w:val="10"/>
+        </w:numPr>
+        <w:spacing w:before="120" w:after="60" w:line="240" w:lineRule="auto"/>
+        <w:ind w:left="0" w:leftChars="0" w:firstLine="0" w:firstLineChars="0"/>
+        <w:jc w:val="left"/>
+        <w:outlineLvl w:val="0"/>
       </w:pPr>
       <w:r>
         <w:rPr>
-          <w:rFonts w:ascii="Times New Roman" w:hAnsi="Times New Roman" w:eastAsia="宋体"/>
-          <w:sz w:val="21"/>
+          <w:rFonts w:ascii="SimHei" w:hAnsi="SimHei" w:eastAsia="SimHei" w:cs="SimHei"/>
+          <w:b/>
+          <w:bCs w:val="1"/>
+          <w:color w:val="auto"/>
+          <w:sz w:val="28"/>
+          <w:szCs w:val="28"/>
         </w:rPr>
-        <w:t>在此填写问题分析，并保持标题层级与代码模块、类和接口的组织结构一致。</w:t>
+        <w:t>实验结果与分析</w:t>
       </w:r>
     </w:p>
     <w:p>
       <w:pPr>
-        <w:pStyle w:val="Heading2"/>
+        <w:pStyle w:val="SZUBody"/>
       </w:pPr>
       <w:r>
-        <w:t>2.2 设计与实现</w:t>
+        <w:rPr>
+          <w:rFonts w:ascii="Times New Roman" w:hAnsi="Times New Roman" w:eastAsia="SimSun" w:cs="Times New Roman"/>
+          <w:b w:val="0"/>
+          <w:bCs w:val="0"/>
+          <w:color w:val="auto"/>
+          <w:sz w:val="21"/>
+          <w:szCs w:val="21"/>
+        </w:rPr>
+        <w:t>加入实际结果及对应分析，缺失证据不得编造。</w:t>
       </w:r>
     </w:p>
     <w:p>
       <w:pPr>
-        <w:pStyle w:val="Heading3"/>
+        <w:pStyle w:val="SZUHeading1"/>
+        <w:keepNext w:val="1"/>
+        <w:keepLines w:val="1"/>
+        <w:pageBreakBefore w:val="0"/>
+        <w:numPr>
+          <w:ilvl w:val="0"/>
+          <w:numId w:val="10"/>
+        </w:numPr>
+        <w:spacing w:before="120" w:after="60" w:line="240" w:lineRule="auto"/>
+        <w:ind w:left="0" w:leftChars="0" w:firstLine="0" w:firstLineChars="0"/>
+        <w:jc w:val="left"/>
+        <w:outlineLvl w:val="0"/>
       </w:pPr>
       <w:r>
-        <w:t>2.2.1 核心模块</w:t>
+        <w:rPr>
+          <w:rFonts w:ascii="SimHei" w:hAnsi="SimHei" w:eastAsia="SimHei" w:cs="SimHei"/>
+          <w:b/>
+          <w:bCs w:val="1"/>
+          <w:color w:val="auto"/>
+          <w:sz w:val="28"/>
+          <w:szCs w:val="28"/>
+        </w:rPr>
+        <w:t>实验结论</w:t>
       </w:r>
     </w:p>
     <w:p>
       <w:pPr>
-        <w:ind w:firstLine="420"/>
-        <w:jc w:val="both"/>
+        <w:pStyle w:val="SZUBody"/>
       </w:pPr>
       <w:r>
         <w:rPr>
-          <w:rFonts w:ascii="Times New Roman" w:hAnsi="Times New Roman" w:eastAsia="宋体"/>
+          <w:rFonts w:ascii="Times New Roman" w:hAnsi="Times New Roman" w:eastAsia="SimSun" w:cs="Times New Roman"/>
+          <w:b w:val="0"/>
+          <w:bCs w:val="0"/>
+          <w:color w:val="auto"/>
           <w:sz w:val="21"/>
+          <w:szCs w:val="21"/>
         </w:rPr>
-        <w:t>在此填写设计与实现内容。</w:t>
-      </w:r>
-    </w:p>
-    <w:p>
-      <w:pPr>
-        <w:ind w:firstLine="420"/>
-        <w:jc w:val="both"/>
-      </w:pPr>
-      <w:r>
-        <w:rPr>
-          <w:rFonts w:ascii="Times New Roman" w:hAnsi="Times New Roman" w:eastAsia="宋体"/>
-          <w:sz w:val="21"/>
-        </w:rPr>
-        <w:t>（1）正文中需要区分多个项目时，必须使用中文括号序号。</w:t>
-      </w:r>
-    </w:p>
-    <w:p>
-      <w:pPr>
-        <w:ind w:firstLine="420"/>
-        <w:jc w:val="both"/>
-      </w:pPr>
-      <w:r>
-        <w:rPr>
-          <w:rFonts w:ascii="Times New Roman" w:hAnsi="Times New Roman" w:eastAsia="宋体"/>
-          <w:sz w:val="21"/>
-        </w:rPr>
-        <w:t>（2）禁止使用点、横线或装饰性符号作为正文项目标记。</w:t>
-      </w:r>
-    </w:p>
-    <w:tbl>
-      <w:tblPr>
-        <w:tblStyle w:val="TableGrid"/>
-        <w:tblW w:type="auto" w:w="0"/>
-        <w:jc w:val="center"/>
-        <w:tblLook w:firstColumn="1" w:firstRow="1" w:lastColumn="0" w:lastRow="0" w:noHBand="0" w:noVBand="1" w:val="04A0"/>
-        <w:tblBorders>
-          <w:top w:val="single" w:sz="4" w:color="000000"/>
-          <w:left w:val="single" w:sz="4" w:color="000000"/>
-          <w:bottom w:val="single" w:sz="4" w:color="000000"/>
-          <w:right w:val="single" w:sz="4" w:color="000000"/>
-          <w:insideH w:val="single" w:sz="4" w:color="000000"/>
-          <w:insideV w:val="single" w:sz="4" w:color="000000"/>
-        </w:tblBorders>
-      </w:tblPr>
-      <w:tblGrid>
-        <w:gridCol w:w="2771"/>
-        <w:gridCol w:w="2771"/>
-        <w:gridCol w:w="2771"/>
-      </w:tblGrid>
-      <w:tr>
-        <w:tc>
-          <w:tcPr>
-            <w:tcW w:type="dxa" w:w="2771"/>
-            <w:tcMar>
-              <w:top w:w="80" w:type="dxa"/>
-              <w:start w:w="100" w:type="dxa"/>
-              <w:bottom w:w="80" w:type="dxa"/>
-              <w:end w:w="100" w:type="dxa"/>
-            </w:tcMar>
-            <w:shd w:fill="FFFFFF"/>
-            <w:vAlign w:val="center"/>
-          </w:tcPr>
-          <w:p>
-            <w:pPr>
-              <w:jc w:val="center"/>
-            </w:pPr>
-            <w:r>
-              <w:rPr>
-                <w:rFonts w:ascii="Times New Roman" w:hAnsi="Times New Roman" w:eastAsia="宋体"/>
-                <w:b/>
-                <w:sz w:val="21"/>
-              </w:rPr>
-              <w:t>项目</w:t>
-            </w:r>
-          </w:p>
-        </w:tc>
-        <w:tc>
-          <w:tcPr>
-            <w:tcW w:type="dxa" w:w="2771"/>
-            <w:tcMar>
-              <w:top w:w="80" w:type="dxa"/>
-              <w:start w:w="100" w:type="dxa"/>
-              <w:bottom w:w="80" w:type="dxa"/>
-              <w:end w:w="100" w:type="dxa"/>
-            </w:tcMar>
-            <w:shd w:fill="FFFFFF"/>
-            <w:vAlign w:val="center"/>
-          </w:tcPr>
-          <w:p>
-            <w:pPr>
-              <w:jc w:val="center"/>
-            </w:pPr>
-            <w:r>
-              <w:rPr>
-                <w:rFonts w:ascii="Times New Roman" w:hAnsi="Times New Roman" w:eastAsia="宋体"/>
-                <w:b/>
-                <w:sz w:val="21"/>
-              </w:rPr>
-              <w:t>说明</w:t>
-            </w:r>
-          </w:p>
-        </w:tc>
-        <w:tc>
-          <w:tcPr>
-            <w:tcW w:type="dxa" w:w="2771"/>
-            <w:tcMar>
-              <w:top w:w="80" w:type="dxa"/>
-              <w:start w:w="100" w:type="dxa"/>
-              <w:bottom w:w="80" w:type="dxa"/>
-              <w:end w:w="100" w:type="dxa"/>
-            </w:tcMar>
-            <w:shd w:fill="FFFFFF"/>
-            <w:vAlign w:val="center"/>
-          </w:tcPr>
-          <w:p>
-            <w:pPr>
-              <w:jc w:val="center"/>
-            </w:pPr>
-            <w:r>
-              <w:rPr>
-                <w:rFonts w:ascii="Times New Roman" w:hAnsi="Times New Roman" w:eastAsia="宋体"/>
-                <w:b/>
-                <w:sz w:val="21"/>
-              </w:rPr>
-              <w:t>结果</w:t>
-            </w:r>
-          </w:p>
-        </w:tc>
-      </w:tr>
-      <w:tr>
-        <w:tc>
-          <w:tcPr>
-            <w:tcW w:type="dxa" w:w="2771"/>
-            <w:tcMar>
-              <w:top w:w="80" w:type="dxa"/>
-              <w:start w:w="100" w:type="dxa"/>
-              <w:bottom w:w="80" w:type="dxa"/>
-              <w:end w:w="100" w:type="dxa"/>
-            </w:tcMar>
-            <w:shd w:fill="FFFFFF"/>
-            <w:vAlign w:val="center"/>
-          </w:tcPr>
-          <w:p>
-            <w:pPr>
-              <w:jc w:val="left"/>
-            </w:pPr>
-            <w:r>
-              <w:rPr>
-                <w:rFonts w:ascii="Times New Roman" w:hAnsi="Times New Roman" w:eastAsia="宋体"/>
-                <w:b w:val="0"/>
-                <w:sz w:val="21"/>
-              </w:rPr>
-              <w:t>示例</w:t>
-            </w:r>
-          </w:p>
-        </w:tc>
-        <w:tc>
-          <w:tcPr>
-            <w:tcW w:type="dxa" w:w="2771"/>
-            <w:tcMar>
-              <w:top w:w="80" w:type="dxa"/>
-              <w:start w:w="100" w:type="dxa"/>
-              <w:bottom w:w="80" w:type="dxa"/>
-              <w:end w:w="100" w:type="dxa"/>
-            </w:tcMar>
-            <w:shd w:fill="FFFFFF"/>
-            <w:vAlign w:val="center"/>
-          </w:tcPr>
-          <w:p>
-            <w:pPr>
-              <w:jc w:val="left"/>
-            </w:pPr>
-            <w:r>
-              <w:rPr>
-                <w:rFonts w:ascii="Times New Roman" w:hAnsi="Times New Roman" w:eastAsia="宋体"/>
-                <w:b w:val="0"/>
-                <w:sz w:val="21"/>
-              </w:rPr>
-              <w:t>替换为实际内容</w:t>
-            </w:r>
-          </w:p>
-        </w:tc>
-        <w:tc>
-          <w:tcPr>
-            <w:tcW w:type="dxa" w:w="2771"/>
-            <w:tcMar>
-              <w:top w:w="80" w:type="dxa"/>
-              <w:start w:w="100" w:type="dxa"/>
-              <w:bottom w:w="80" w:type="dxa"/>
-              <w:end w:w="100" w:type="dxa"/>
-            </w:tcMar>
-            <w:shd w:fill="FFFFFF"/>
-            <w:vAlign w:val="center"/>
-          </w:tcPr>
-          <w:p>
-            <w:pPr>
-              <w:jc w:val="left"/>
-            </w:pPr>
-            <w:r>
-              <w:rPr>
-                <w:rFonts w:ascii="Times New Roman" w:hAnsi="Times New Roman" w:eastAsia="宋体"/>
-                <w:b w:val="0"/>
-                <w:sz w:val="21"/>
-              </w:rPr>
-              <w:t>通过</w:t>
-            </w:r>
-          </w:p>
-        </w:tc>
-      </w:tr>
-    </w:tbl>
-    <w:p>
-      <w:pPr>
-        <w:pStyle w:val="Caption"/>
-        <w:jc w:val="center"/>
-      </w:pPr>
-      <w:r>
-        <w:rPr>
-          <w:rFonts w:ascii="Times New Roman" w:hAnsi="Times New Roman" w:eastAsia="宋体"/>
-          <w:sz w:val="21"/>
-        </w:rPr>
-        <w:t>图 1 系统结构示意图（占位）</w:t>
-      </w:r>
-    </w:p>
-    <w:p>
-      <w:pPr>
-        <w:pStyle w:val="Heading1"/>
-      </w:pPr>
-      <w:r>
-        <w:t>3 实验结果与分析</w:t>
-      </w:r>
-    </w:p>
-    <w:p>
-      <w:pPr>
-        <w:ind w:firstLine="420"/>
-        <w:jc w:val="both"/>
-      </w:pPr>
-      <w:r>
-        <w:rPr>
-          <w:rFonts w:ascii="Times New Roman" w:hAnsi="Times New Roman" w:eastAsia="宋体"/>
-          <w:sz w:val="21"/>
-        </w:rPr>
-        <w:t>在此填写实验结果及分析。</w:t>
-      </w:r>
-    </w:p>
-    <w:p>
-      <w:pPr>
-        <w:pStyle w:val="Heading1"/>
-      </w:pPr>
-      <w:r>
-        <w:t>4 总结</w:t>
-      </w:r>
-    </w:p>
-    <w:p>
-      <w:pPr>
-        <w:ind w:firstLine="420"/>
-        <w:jc w:val="both"/>
-      </w:pPr>
-      <w:r>
-        <w:rPr>
-          <w:rFonts w:ascii="Times New Roman" w:hAnsi="Times New Roman" w:eastAsia="宋体"/>
-          <w:sz w:val="21"/>
-        </w:rPr>
-        <w:t>在此填写总结。</w:t>
+        <w:t>根据已完成实验总结结论和局限。</w:t>
       </w:r>
     </w:p>
     <w:sectPr>
       <w:pgSz w:w="11906" w:h="16838"/>
       <w:pgMar w:top="1440" w:right="1797" w:bottom="1440" w:left="1797" w:header="720" w:footer="720" w:gutter="0"/>
+      <w:pgBorders w:offsetFrom="text" w:display="notFirstPage">
+        <w:top w:val="single" w:sz="4" w:space="4" w:color="000000"/>
+        <w:left w:val="single" w:sz="4" w:space="4" w:color="000000"/>
+        <w:bottom w:val="single" w:sz="4" w:space="4" w:color="000000"/>
+        <w:right w:val="single" w:sz="4" w:space="4" w:color="000000"/>
+      </w:pgBorders>
       <w:cols w:space="720"/>
       <w:docGrid w:linePitch="360"/>
     </w:sectPr>
@@ -539,6 +403,89 @@
       </w:rPr>
     </w:lvl>
   </w:abstractNum>
+  <w:abstractNum w:abstractNumId="9">
+    <w:multiLevelType w:val="multilevel"/>
+    <w:lvl w:ilvl="0">
+      <w:start w:val="1"/>
+      <w:numFmt w:val="chineseCounting"/>
+      <w:pStyle w:val="SZUHeading1"/>
+      <w:suff w:val="nothing"/>
+      <w:lvlText w:val="%1、"/>
+      <w:lvlJc w:val="left"/>
+      <w:pPr>
+        <w:ind w:left="0" w:leftChars="0" w:firstLine="0" w:firstLineChars="0"/>
+      </w:pPr>
+      <w:rPr>
+        <w:rFonts w:ascii="SimHei" w:hAnsi="SimHei" w:eastAsia="SimHei"/>
+        <w:b w:val="1"/>
+        <w:sz w:val="28"/>
+      </w:rPr>
+    </w:lvl>
+    <w:lvl w:ilvl="1">
+      <w:start w:val="1"/>
+      <w:numFmt w:val="chineseCounting"/>
+      <w:pStyle w:val="SZUHeading2"/>
+      <w:suff w:val="nothing"/>
+      <w:lvlText w:val="(%2)"/>
+      <w:lvlJc w:val="left"/>
+      <w:pPr>
+        <w:ind w:left="0" w:leftChars="0" w:firstLine="0" w:firstLineChars="0"/>
+      </w:pPr>
+      <w:rPr>
+        <w:rFonts w:ascii="SimSun" w:hAnsi="SimSun" w:eastAsia="SimSun"/>
+        <w:b w:val="0"/>
+        <w:sz w:val="24"/>
+      </w:rPr>
+    </w:lvl>
+    <w:lvl w:ilvl="2">
+      <w:start w:val="1"/>
+      <w:numFmt w:val="decimal"/>
+      <w:pStyle w:val="SZUHeading3"/>
+      <w:suff w:val="nothing"/>
+      <w:lvlText w:val="%3."/>
+      <w:lvlJc w:val="left"/>
+      <w:pPr>
+        <w:ind w:left="480" w:leftChars="200" w:firstLine="0" w:firstLineChars="0"/>
+      </w:pPr>
+      <w:rPr>
+        <w:rFonts w:ascii="SimSun" w:hAnsi="SimSun" w:eastAsia="SimSun"/>
+        <w:b w:val="0"/>
+        <w:sz w:val="24"/>
+      </w:rPr>
+    </w:lvl>
+    <w:lvl w:ilvl="3">
+      <w:start w:val="1"/>
+      <w:numFmt w:val="decimal"/>
+      <w:pStyle w:val="SZUHeading4"/>
+      <w:suff w:val="nothing"/>
+      <w:lvlText w:val="(%4)"/>
+      <w:lvlJc w:val="left"/>
+      <w:pPr>
+        <w:ind w:left="480" w:leftChars="200" w:firstLine="0" w:firstLineChars="0"/>
+      </w:pPr>
+      <w:rPr>
+        <w:rFonts w:ascii="SimSun" w:hAnsi="SimSun" w:eastAsia="SimSun"/>
+        <w:b w:val="0"/>
+        <w:sz w:val="24"/>
+      </w:rPr>
+    </w:lvl>
+    <w:lvl w:ilvl="4">
+      <w:start w:val="1"/>
+      <w:numFmt w:val="decimalEnclosedCircle"/>
+      <w:pStyle w:val="SZUHeading5"/>
+      <w:suff w:val="nothing"/>
+      <w:lvlText w:val="%5"/>
+      <w:lvlJc w:val="left"/>
+      <w:pPr>
+        <w:ind w:left="480" w:leftChars="200" w:firstLine="0" w:firstLineChars="0"/>
+      </w:pPr>
+      <w:rPr>
+        <w:rFonts w:ascii="SimSun" w:hAnsi="SimSun" w:eastAsia="SimSun"/>
+        <w:b w:val="0"/>
+        <w:sz w:val="24"/>
+      </w:rPr>
+    </w:lvl>
+  </w:abstractNum>
   <w:num w:numId="1">
     <w:abstractNumId w:val="8"/>
   </w:num>
@@ -565,6 +512,9 @@
   </w:num>
   <w:num w:numId="9">
     <w:abstractNumId w:val="0"/>
+  </w:num>
+  <w:num w:numId="10">
+    <w:abstractNumId w:val="9"/>
   </w:num>
 </w:numbering>
 </file>
@@ -729,11 +679,6 @@
     <w:name w:val="Normal"/>
     <w:qFormat/>
     <w:rsid w:val="00FC693F"/>
-    <w:rPr>
-      <w:rFonts w:ascii="Times New Roman" w:hAnsi="Times New Roman" w:eastAsia="宋体"/>
-      <w:b w:val="0"/>
-      <w:sz w:val="21"/>
-    </w:rPr>
   </w:style>
   <w:style w:type="paragraph" w:styleId="Header">
     <w:name w:val="header"/>
@@ -794,9 +739,10 @@
       <w:outlineLvl w:val="0"/>
     </w:pPr>
     <w:rPr>
-      <w:rFonts w:asciiTheme="majorHAnsi" w:eastAsiaTheme="majorEastAsia" w:hAnsiTheme="majorHAnsi" w:cstheme="majorBidi" w:ascii="Times New Roman" w:hAnsi="Times New Roman" w:eastAsia="宋体"/>
+      <w:rFonts w:asciiTheme="majorHAnsi" w:eastAsiaTheme="majorEastAsia" w:hAnsiTheme="majorHAnsi" w:cstheme="majorBidi"/>
       <w:b/>
       <w:bCs/>
+      <w:color w:val="365F91" w:themeColor="accent1" w:themeShade="BF"/>
       <w:sz w:val="28"/>
       <w:szCs w:val="28"/>
     </w:rPr>
@@ -817,10 +763,11 @@
       <w:outlineLvl w:val="1"/>
     </w:pPr>
     <w:rPr>
-      <w:rFonts w:asciiTheme="majorHAnsi" w:eastAsiaTheme="majorEastAsia" w:hAnsiTheme="majorHAnsi" w:cstheme="majorBidi" w:ascii="Times New Roman" w:hAnsi="Times New Roman" w:eastAsia="宋体"/>
+      <w:rFonts w:asciiTheme="majorHAnsi" w:eastAsiaTheme="majorEastAsia" w:hAnsiTheme="majorHAnsi" w:cstheme="majorBidi"/>
       <w:b/>
       <w:bCs/>
-      <w:sz w:val="24"/>
+      <w:color w:val="4F81BD" w:themeColor="accent1"/>
+      <w:sz w:val="26"/>
       <w:szCs w:val="26"/>
     </w:rPr>
   </w:style>
@@ -840,10 +787,10 @@
       <w:outlineLvl w:val="2"/>
     </w:pPr>
     <w:rPr>
-      <w:rFonts w:asciiTheme="majorHAnsi" w:eastAsiaTheme="majorEastAsia" w:hAnsiTheme="majorHAnsi" w:cstheme="majorBidi" w:ascii="Times New Roman" w:hAnsi="Times New Roman" w:eastAsia="宋体"/>
+      <w:rFonts w:asciiTheme="majorHAnsi" w:eastAsiaTheme="majorEastAsia" w:hAnsiTheme="majorHAnsi" w:cstheme="majorBidi"/>
       <w:b/>
       <w:bCs/>
-      <w:sz w:val="21"/>
+      <w:color w:val="4F81BD" w:themeColor="accent1"/>
     </w:rPr>
   </w:style>
   <w:style w:type="paragraph" w:styleId="Heading4">
@@ -863,12 +810,12 @@
       <w:outlineLvl w:val="3"/>
     </w:pPr>
     <w:rPr>
-      <w:rFonts w:asciiTheme="majorHAnsi" w:eastAsiaTheme="majorEastAsia" w:hAnsiTheme="majorHAnsi" w:cstheme="majorBidi" w:ascii="Times New Roman" w:hAnsi="Times New Roman" w:eastAsia="宋体"/>
+      <w:rFonts w:asciiTheme="majorHAnsi" w:eastAsiaTheme="majorEastAsia" w:hAnsiTheme="majorHAnsi" w:cstheme="majorBidi"/>
       <w:b/>
       <w:bCs/>
       <w:i/>
       <w:iCs/>
-      <w:sz w:val="18"/>
+      <w:color w:val="4F81BD" w:themeColor="accent1"/>
     </w:rPr>
   </w:style>
   <w:style w:type="paragraph" w:styleId="Heading5">
@@ -1074,15 +1021,18 @@
     <w:qFormat/>
     <w:rsid w:val="00FC693F"/>
     <w:pPr>
+      <w:pBdr>
+        <w:bottom w:val="single" w:sz="8" w:space="4" w:color="4F81BD" w:themeColor="accent1"/>
+      </w:pBdr>
       <w:spacing w:after="300" w:line="240" w:lineRule="auto"/>
       <w:contextualSpacing/>
     </w:pPr>
     <w:rPr>
-      <w:rFonts w:asciiTheme="majorHAnsi" w:eastAsiaTheme="majorEastAsia" w:hAnsiTheme="majorHAnsi" w:cstheme="majorBidi" w:ascii="Times New Roman" w:hAnsi="Times New Roman" w:eastAsia="宋体"/>
-      <w:b w:val="0"/>
+      <w:rFonts w:asciiTheme="majorHAnsi" w:eastAsiaTheme="majorEastAsia" w:hAnsiTheme="majorHAnsi" w:cstheme="majorBidi"/>
+      <w:color w:val="17365D" w:themeColor="text2" w:themeShade="BF"/>
       <w:spacing w:val="5"/>
       <w:kern w:val="28"/>
-      <w:sz w:val="30"/>
+      <w:sz w:val="52"/>
       <w:szCs w:val="52"/>
     </w:rPr>
   </w:style>
@@ -1520,10 +1470,10 @@
       <w:spacing w:line="240" w:lineRule="auto"/>
     </w:pPr>
     <w:rPr>
-      <w:rFonts w:ascii="Times New Roman" w:hAnsi="Times New Roman" w:eastAsia="宋体"/>
-      <w:b w:val="0"/>
+      <w:b/>
       <w:bCs/>
-      <w:sz w:val="21"/>
+      <w:color w:val="4F81BD" w:themeColor="accent1"/>
+      <w:sz w:val="18"/>
       <w:szCs w:val="18"/>
     </w:rPr>
   </w:style>
@@ -12411,6 +12361,181 @@
         <w:shd w:val="clear" w:color="auto" w:fill="FBCAA2" w:themeFill="accent6" w:themeFillTint="7F"/>
       </w:tcPr>
     </w:tblStylePr>
+  </w:style>
+  <w:style w:type="paragraph" w:customStyle="1" w:styleId="SZUHeading1">
+    <w:name w:val="SZUHeading1"/>
+    <w:pPr>
+      <w:keepNext/>
+      <w:keepLines/>
+      <w:numPr>
+        <w:ilvl w:val="0"/>
+        <w:numId w:val="10"/>
+      </w:numPr>
+      <w:spacing w:before="120" w:after="60" w:line="240" w:lineRule="auto"/>
+      <w:ind w:left="0" w:leftChars="0" w:firstLine="0" w:firstLineChars="0"/>
+      <w:outlineLvl w:val="0"/>
+    </w:pPr>
+    <w:rPr>
+      <w:rFonts w:ascii="SimHei" w:hAnsi="SimHei" w:eastAsia="SimHei" w:cs="SimHei"/>
+      <w:b/>
+      <w:bCs w:val="1"/>
+      <w:color w:val="auto"/>
+      <w:sz w:val="28"/>
+      <w:szCs w:val="28"/>
+    </w:rPr>
+  </w:style>
+  <w:style w:type="paragraph" w:customStyle="1" w:styleId="SZUHeading2">
+    <w:name w:val="SZUHeading2"/>
+    <w:pPr>
+      <w:keepNext/>
+      <w:keepLines/>
+      <w:numPr>
+        <w:ilvl w:val="1"/>
+        <w:numId w:val="10"/>
+      </w:numPr>
+      <w:spacing w:before="120" w:after="60" w:line="240" w:lineRule="auto"/>
+      <w:ind w:left="0" w:leftChars="0" w:firstLine="0" w:firstLineChars="0"/>
+      <w:outlineLvl w:val="1"/>
+    </w:pPr>
+    <w:rPr>
+      <w:rFonts w:ascii="SimSun" w:hAnsi="SimSun" w:eastAsia="SimSun" w:cs="SimSun"/>
+      <w:b w:val="0"/>
+      <w:bCs w:val="0"/>
+      <w:color w:val="auto"/>
+      <w:sz w:val="24"/>
+      <w:szCs w:val="24"/>
+    </w:rPr>
+  </w:style>
+  <w:style w:type="paragraph" w:customStyle="1" w:styleId="SZUHeading3">
+    <w:name w:val="SZUHeading3"/>
+    <w:pPr>
+      <w:keepNext/>
+      <w:keepLines/>
+      <w:numPr>
+        <w:ilvl w:val="2"/>
+        <w:numId w:val="10"/>
+      </w:numPr>
+      <w:spacing w:before="120" w:after="60" w:line="240" w:lineRule="auto"/>
+      <w:ind w:left="480" w:leftChars="200" w:firstLine="0" w:firstLineChars="0"/>
+      <w:outlineLvl w:val="2"/>
+    </w:pPr>
+    <w:rPr>
+      <w:rFonts w:ascii="SimSun" w:hAnsi="SimSun" w:eastAsia="SimSun" w:cs="SimSun"/>
+      <w:b w:val="0"/>
+      <w:bCs w:val="0"/>
+      <w:color w:val="auto"/>
+      <w:sz w:val="24"/>
+      <w:szCs w:val="24"/>
+    </w:rPr>
+  </w:style>
+  <w:style w:type="paragraph" w:customStyle="1" w:styleId="SZUHeading4">
+    <w:name w:val="SZUHeading4"/>
+    <w:pPr>
+      <w:keepNext/>
+      <w:keepLines/>
+      <w:numPr>
+        <w:ilvl w:val="3"/>
+        <w:numId w:val="10"/>
+      </w:numPr>
+      <w:spacing w:before="120" w:after="60" w:line="240" w:lineRule="auto"/>
+      <w:ind w:left="480" w:leftChars="200" w:firstLine="0" w:firstLineChars="0"/>
+      <w:outlineLvl w:val="3"/>
+    </w:pPr>
+    <w:rPr>
+      <w:rFonts w:ascii="SimSun" w:hAnsi="SimSun" w:eastAsia="SimSun" w:cs="SimSun"/>
+      <w:b w:val="0"/>
+      <w:bCs w:val="0"/>
+      <w:color w:val="auto"/>
+      <w:sz w:val="24"/>
+      <w:szCs w:val="24"/>
+    </w:rPr>
+  </w:style>
+  <w:style w:type="paragraph" w:customStyle="1" w:styleId="SZUHeading5">
+    <w:name w:val="SZUHeading5"/>
+    <w:pPr>
+      <w:keepNext/>
+      <w:keepLines/>
+      <w:numPr>
+        <w:ilvl w:val="4"/>
+        <w:numId w:val="10"/>
+      </w:numPr>
+      <w:spacing w:before="120" w:after="60" w:line="240" w:lineRule="auto"/>
+      <w:ind w:left="480" w:leftChars="200" w:firstLine="0" w:firstLineChars="0"/>
+      <w:outlineLvl w:val="4"/>
+    </w:pPr>
+    <w:rPr>
+      <w:rFonts w:ascii="SimSun" w:hAnsi="SimSun" w:eastAsia="SimSun" w:cs="SimSun"/>
+      <w:b w:val="0"/>
+      <w:bCs w:val="0"/>
+      <w:color w:val="auto"/>
+      <w:sz w:val="24"/>
+      <w:szCs w:val="24"/>
+    </w:rPr>
+  </w:style>
+  <w:style w:type="paragraph" w:customStyle="1" w:styleId="SZUBody">
+    <w:name w:val="SZUBody"/>
+    <w:pPr>
+      <w:spacing w:before="0" w:after="120" w:line="300" w:lineRule="auto"/>
+      <w:ind w:firstLine="420" w:left="0"/>
+      <w:outlineLvl w:val="9"/>
+    </w:pPr>
+    <w:rPr>
+      <w:rFonts w:ascii="Times New Roman" w:hAnsi="Times New Roman" w:eastAsia="SimSun" w:cs="Times New Roman"/>
+      <w:b w:val="0"/>
+      <w:bCs w:val="0"/>
+      <w:color w:val="auto"/>
+      <w:sz w:val="21"/>
+      <w:szCs w:val="21"/>
+    </w:rPr>
+  </w:style>
+  <w:style w:type="paragraph" w:customStyle="1" w:styleId="SZUCaption">
+    <w:name w:val="SZUCaption"/>
+    <w:pPr>
+      <w:spacing w:before="0" w:after="0" w:line="240" w:lineRule="auto"/>
+      <w:ind w:firstLine="0" w:left="0"/>
+      <w:jc w:val="center"/>
+      <w:outlineLvl w:val="9"/>
+    </w:pPr>
+    <w:rPr>
+      <w:rFonts w:ascii="Times New Roman" w:hAnsi="Times New Roman" w:eastAsia="SimSun" w:cs="Times New Roman"/>
+      <w:b w:val="0"/>
+      <w:bCs w:val="0"/>
+      <w:color w:val="auto"/>
+      <w:sz w:val="21"/>
+      <w:szCs w:val="21"/>
+    </w:rPr>
+  </w:style>
+  <w:style w:type="paragraph" w:customStyle="1" w:styleId="SZUTable">
+    <w:name w:val="SZUTable"/>
+    <w:pPr>
+      <w:spacing w:before="0" w:after="0" w:line="240" w:lineRule="auto"/>
+      <w:ind w:firstLine="0" w:left="0"/>
+      <w:outlineLvl w:val="9"/>
+    </w:pPr>
+    <w:rPr>
+      <w:rFonts w:ascii="Times New Roman" w:hAnsi="Times New Roman" w:eastAsia="SimSun" w:cs="Times New Roman"/>
+      <w:b w:val="0"/>
+      <w:bCs w:val="0"/>
+      <w:color w:val="auto"/>
+      <w:sz w:val="21"/>
+      <w:szCs w:val="21"/>
+    </w:rPr>
+  </w:style>
+  <w:style w:type="paragraph" w:customStyle="1" w:styleId="CodeBox">
+    <w:name w:val="CodeBox"/>
+    <w:pPr>
+      <w:spacing w:before="0" w:after="0" w:line="240" w:lineRule="auto"/>
+      <w:ind w:firstLine="0" w:left="0"/>
+      <w:outlineLvl w:val="9"/>
+    </w:pPr>
+    <w:rPr>
+      <w:rFonts w:ascii="Times New Roman" w:hAnsi="Times New Roman" w:eastAsia="SimSun" w:cs="Times New Roman"/>
+      <w:b w:val="0"/>
+      <w:bCs w:val="0"/>
+      <w:color w:val="auto"/>
+      <w:sz w:val="18"/>
+      <w:szCs w:val="18"/>
+    </w:rPr>
   </w:style>
 </w:styles>
 </file>

</xml_diff>